<commit_message>
Deploying to gh-pages from @ UCD-SERG/serocalculator@1fe6bd1f12ee1ea524d8fa7c32f07fc9a8936c57 🚀
</commit_message>
<xml_diff>
--- a/dev/vignettes/articles/enteric_fever_example.docx
+++ b/dev/vignettes/articles/enteric_fever_example.docx
@@ -1215,7 +1215,7 @@
         <w:rPr>
           <w:rStyle w:val="CommentTok"/>
         </w:rPr>
-        <w:t xml:space="preserve">#&gt; n = 1000 </w:t>
+        <w:t xml:space="preserve">#&gt; n = 516 </w:t>
       </w:r>
       <w:r>
         <w:br/>
@@ -1278,7 +1278,7 @@
         <w:rPr>
           <w:rStyle w:val="CommentTok"/>
         </w:rPr>
-        <w:t xml:space="preserve">#&gt; 1  1000   0.8           5.38   10.1  10.7           14.8  24.8</w:t>
+        <w:t xml:space="preserve">#&gt; 1   516   0.8           5.38   10.1  10.7           14.8  24.8</w:t>
       </w:r>
       <w:r>
         <w:br/>

</xml_diff>